<commit_message>
feat(painel): progresso das famílias e satisfação no painel e nos relatórios (F6)
- painel com abas Operação / Progresso das famílias / Satisfação; rotas /api/painel/progresso e /satisfacao
- % melhoraram/iguais/pioraram por dimensão e unidade, faixas do índice, metas; NPS, concordância, recusa e cobertura
- n mínimo oculta percentuais em recortes pequenos; comentários só para coordenação e admin
- alertas consolidados (sem meta, pesquisa e reavaliação pendentes)
- semestral .docx com seções 4 (evolução) e 5 (satisfação); CSVs progresso/satisfação; metas no individual
- migração 084: limiares provisórios dos semáforos editáveis; service worker associal-v18

Co-Authored-By: Claude Opus 5.5 <noreply@anthropic.com>
</commit_message>
<xml_diff>
--- a/server/templates/semestral.docx
+++ b/server/templates/semestral.docx
@@ -1022,9 +1022,9 @@
       </w:tblPr>
       <w:tblGrid>
         <w:gridCol w:w="1178"/>
-        <w:gridCol w:w="3769"/>
-        <w:gridCol w:w="2827"/>
-        <w:gridCol w:w="1296"/>
+        <w:gridCol w:w="3534"/>
+        <w:gridCol w:w="2591"/>
+        <w:gridCol w:w="1767"/>
       </w:tblGrid>
       <w:tr>
         <w:trPr>
@@ -1062,7 +1062,7 @@
         </w:tc>
         <w:tc>
           <w:tcPr>
-            <w:tcW w:w="3769" w:type="dxa"/>
+            <w:tcW w:w="3534" w:type="dxa"/>
             <w:shd w:val="clear" w:color="auto" w:fill="D9E2D5"/>
           </w:tcPr>
           <w:p>
@@ -1091,7 +1091,7 @@
         </w:tc>
         <w:tc>
           <w:tcPr>
-            <w:tcW w:w="2827" w:type="dxa"/>
+            <w:tcW w:w="2591" w:type="dxa"/>
             <w:shd w:val="clear" w:color="auto" w:fill="D9E2D5"/>
           </w:tcPr>
           <w:p>
@@ -1120,7 +1120,7 @@
         </w:tc>
         <w:tc>
           <w:tcPr>
-            <w:tcW w:w="1296" w:type="dxa"/>
+            <w:tcW w:w="1767" w:type="dxa"/>
             <w:shd w:val="clear" w:color="auto" w:fill="D9E2D5"/>
           </w:tcPr>
           <w:p>
@@ -1178,7 +1178,7 @@
         </w:tc>
         <w:tc>
           <w:tcPr>
-            <w:tcW w:w="3769" w:type="dxa"/>
+            <w:tcW w:w="3534" w:type="dxa"/>
           </w:tcPr>
           <w:p>
             <w:pPr>
@@ -1202,7 +1202,7 @@
         </w:tc>
         <w:tc>
           <w:tcPr>
-            <w:tcW w:w="2827" w:type="dxa"/>
+            <w:tcW w:w="2591" w:type="dxa"/>
           </w:tcPr>
           <w:p>
             <w:pPr>
@@ -1226,7 +1226,7 @@
         </w:tc>
         <w:tc>
           <w:tcPr>
-            <w:tcW w:w="1296" w:type="dxa"/>
+            <w:tcW w:w="1767" w:type="dxa"/>
           </w:tcPr>
           <w:p>
             <w:pPr>
@@ -1464,11 +1464,11 @@
         </w:tblCellMar>
       </w:tblPr>
       <w:tblGrid>
-        <w:gridCol w:w="1314"/>
-        <w:gridCol w:w="1183"/>
-        <w:gridCol w:w="1972"/>
-        <w:gridCol w:w="3155"/>
-        <w:gridCol w:w="1446"/>
+        <w:gridCol w:w="1242"/>
+        <w:gridCol w:w="1118"/>
+        <w:gridCol w:w="1864"/>
+        <w:gridCol w:w="2982"/>
+        <w:gridCol w:w="1864"/>
       </w:tblGrid>
       <w:tr>
         <w:trPr>
@@ -1477,7 +1477,7 @@
         </w:trPr>
         <w:tc>
           <w:tcPr>
-            <w:tcW w:w="1314" w:type="dxa"/>
+            <w:tcW w:w="1242" w:type="dxa"/>
             <w:shd w:val="clear" w:color="auto" w:fill="D9E2D5"/>
           </w:tcPr>
           <w:p>
@@ -1506,7 +1506,7 @@
         </w:tc>
         <w:tc>
           <w:tcPr>
-            <w:tcW w:w="1183" w:type="dxa"/>
+            <w:tcW w:w="1118" w:type="dxa"/>
             <w:shd w:val="clear" w:color="auto" w:fill="D9E2D5"/>
           </w:tcPr>
           <w:p>
@@ -1535,7 +1535,7 @@
         </w:tc>
         <w:tc>
           <w:tcPr>
-            <w:tcW w:w="1972" w:type="dxa"/>
+            <w:tcW w:w="1864" w:type="dxa"/>
             <w:shd w:val="clear" w:color="auto" w:fill="D9E2D5"/>
           </w:tcPr>
           <w:p>
@@ -1564,7 +1564,7 @@
         </w:tc>
         <w:tc>
           <w:tcPr>
-            <w:tcW w:w="3155" w:type="dxa"/>
+            <w:tcW w:w="2982" w:type="dxa"/>
             <w:shd w:val="clear" w:color="auto" w:fill="D9E2D5"/>
           </w:tcPr>
           <w:p>
@@ -1593,7 +1593,7 @@
         </w:tc>
         <w:tc>
           <w:tcPr>
-            <w:tcW w:w="1446" w:type="dxa"/>
+            <w:tcW w:w="1864" w:type="dxa"/>
             <w:shd w:val="clear" w:color="auto" w:fill="D9E2D5"/>
           </w:tcPr>
           <w:p>
@@ -1627,7 +1627,7 @@
         </w:trPr>
         <w:tc>
           <w:tcPr>
-            <w:tcW w:w="1314" w:type="dxa"/>
+            <w:tcW w:w="1242" w:type="dxa"/>
           </w:tcPr>
           <w:p>
             <w:pPr>
@@ -1651,7 +1651,7 @@
         </w:tc>
         <w:tc>
           <w:tcPr>
-            <w:tcW w:w="1183" w:type="dxa"/>
+            <w:tcW w:w="1118" w:type="dxa"/>
           </w:tcPr>
           <w:p>
             <w:pPr>
@@ -1675,7 +1675,7 @@
         </w:tc>
         <w:tc>
           <w:tcPr>
-            <w:tcW w:w="1972" w:type="dxa"/>
+            <w:tcW w:w="1864" w:type="dxa"/>
           </w:tcPr>
           <w:p>
             <w:pPr>
@@ -1699,7 +1699,7 @@
         </w:tc>
         <w:tc>
           <w:tcPr>
-            <w:tcW w:w="3155" w:type="dxa"/>
+            <w:tcW w:w="2982" w:type="dxa"/>
           </w:tcPr>
           <w:p>
             <w:pPr>
@@ -1723,7 +1723,7 @@
         </w:tc>
         <w:tc>
           <w:tcPr>
-            <w:tcW w:w="1446" w:type="dxa"/>
+            <w:tcW w:w="1864" w:type="dxa"/>
           </w:tcPr>
           <w:p>
             <w:pPr>
@@ -2673,6 +2673,24 @@
     </w:p>
     <w:p>
       <w:pPr>
+        <w:spacing w:before="0" w:after="0" w:line="240" w:lineRule="auto"/>
+        <w:rPr>
+          <w:rFonts w:ascii="Arial" w:hAnsi="Arial" w:cs="Arial"/>
+          <w:sz w:val="24"/>
+          <w:szCs w:val="24"/>
+        </w:rPr>
+      </w:pPr>
+      <w:r>
+        <w:rPr>
+          <w:rFonts w:ascii="Arial" w:hAnsi="Arial" w:cs="Arial"/>
+          <w:sz w:val="24"/>
+          <w:szCs w:val="24"/>
+        </w:rPr>
+        <w:t xml:space="preserve">{#temProgresso}</w:t>
+      </w:r>
+    </w:p>
+    <w:p>
+      <w:pPr>
         <w:keepNext/>
         <w:spacing w:before="240" w:after="120" w:line="240" w:lineRule="auto"/>
         <w:rPr>
@@ -2691,7 +2709,2302 @@
           <w:sz w:val="24"/>
           <w:szCs w:val="24"/>
         </w:rPr>
-        <w:t xml:space="preserve">4. Considerações finais</w:t>
+        <w:t xml:space="preserve">4. Acompanhamento e evolução das famílias</w:t>
+      </w:r>
+    </w:p>
+    <w:p>
+      <w:pPr>
+        <w:spacing w:before="0" w:after="0" w:line="240" w:lineRule="auto"/>
+        <w:rPr>
+          <w:rFonts w:ascii="Arial" w:hAnsi="Arial" w:cs="Arial"/>
+          <w:sz w:val="24"/>
+          <w:szCs w:val="24"/>
+        </w:rPr>
+      </w:pPr>
+      <w:r>
+        <w:rPr>
+          <w:rFonts w:ascii="Arial" w:hAnsi="Arial" w:cs="Arial"/>
+          <w:sz w:val="24"/>
+          <w:szCs w:val="24"/>
+        </w:rPr>
+        <w:t xml:space="preserve">{#progresso}</w:t>
+      </w:r>
+    </w:p>
+    <w:p>
+      <w:pPr>
+        <w:spacing w:before="0" w:after="120" w:line="360" w:lineRule="auto"/>
+        <w:jc w:val="both"/>
+        <w:rPr>
+          <w:rFonts w:ascii="Arial" w:hAnsi="Arial" w:cs="Arial"/>
+          <w:sz w:val="24"/>
+          <w:szCs w:val="24"/>
+        </w:rPr>
+      </w:pPr>
+      <w:r>
+        <w:rPr>
+          <w:rFonts w:ascii="Arial" w:hAnsi="Arial" w:cs="Arial"/>
+          <w:sz w:val="24"/>
+          <w:szCs w:val="24"/>
+        </w:rPr>
+        <w:t xml:space="preserve">{.}</w:t>
+      </w:r>
+    </w:p>
+    <w:p>
+      <w:pPr>
+        <w:spacing w:before="0" w:after="0" w:line="240" w:lineRule="auto"/>
+        <w:rPr>
+          <w:rFonts w:ascii="Arial" w:hAnsi="Arial" w:cs="Arial"/>
+          <w:sz w:val="24"/>
+          <w:szCs w:val="24"/>
+        </w:rPr>
+      </w:pPr>
+      <w:r>
+        <w:rPr>
+          <w:rFonts w:ascii="Arial" w:hAnsi="Arial" w:cs="Arial"/>
+          <w:sz w:val="24"/>
+          <w:szCs w:val="24"/>
+        </w:rPr>
+        <w:t xml:space="preserve">{/progresso}</w:t>
+      </w:r>
+    </w:p>
+    <w:p>
+      <w:pPr>
+        <w:spacing w:before="0" w:after="0" w:line="240" w:lineRule="auto"/>
+        <w:rPr>
+          <w:rFonts w:ascii="Arial" w:hAnsi="Arial" w:cs="Arial"/>
+          <w:sz w:val="24"/>
+          <w:szCs w:val="24"/>
+        </w:rPr>
+      </w:pPr>
+      <w:r>
+        <w:rPr>
+          <w:rFonts w:ascii="Arial" w:hAnsi="Arial" w:cs="Arial"/>
+          <w:sz w:val="24"/>
+          <w:szCs w:val="24"/>
+        </w:rPr>
+        <w:t xml:space="preserve">{#temTabelaProgresso}</w:t>
+      </w:r>
+    </w:p>
+    <w:p>
+      <w:pPr>
+        <w:keepNext/>
+        <w:spacing w:before="120" w:after="60" w:line="240" w:lineRule="auto"/>
+        <w:rPr>
+          <w:rFonts w:ascii="Arial" w:hAnsi="Arial" w:cs="Arial"/>
+          <w:b/>
+          <w:bCs/>
+          <w:sz w:val="24"/>
+          <w:szCs w:val="24"/>
+        </w:rPr>
+      </w:pPr>
+      <w:r>
+        <w:rPr>
+          <w:rFonts w:ascii="Arial" w:hAnsi="Arial" w:cs="Arial"/>
+          <w:b/>
+          <w:bCs/>
+          <w:sz w:val="24"/>
+          <w:szCs w:val="24"/>
+        </w:rPr>
+        <w:t xml:space="preserve">Famílias que melhoraram, ficaram iguais ou pioraram (índice de progresso)</w:t>
+      </w:r>
+    </w:p>
+    <w:tbl>
+      <w:tblPr>
+        <w:tblW w:w="9070" w:type="dxa"/>
+        <w:tblBorders>
+          <w:top w:val="single" w:sz="4" w:space="0" w:color="808080"/>
+          <w:left w:val="single" w:sz="4" w:space="0" w:color="808080"/>
+          <w:bottom w:val="single" w:sz="4" w:space="0" w:color="808080"/>
+          <w:right w:val="single" w:sz="4" w:space="0" w:color="808080"/>
+          <w:insideH w:val="single" w:sz="4" w:space="0" w:color="808080"/>
+          <w:insideV w:val="single" w:sz="4" w:space="0" w:color="808080"/>
+        </w:tblBorders>
+        <w:tblLayout w:type="fixed"/>
+        <w:tblCellMar>
+          <w:left w:w="80" w:type="dxa"/>
+          <w:right w:w="80" w:type="dxa"/>
+        </w:tblCellMar>
+      </w:tblPr>
+      <w:tblGrid>
+        <w:gridCol w:w="2895"/>
+        <w:gridCol w:w="1158"/>
+        <w:gridCol w:w="1351"/>
+        <w:gridCol w:w="965"/>
+        <w:gridCol w:w="1158"/>
+        <w:gridCol w:w="1544"/>
+      </w:tblGrid>
+      <w:tr>
+        <w:trPr>
+          <w:cantSplit/>
+          <w:tblHeader/>
+        </w:trPr>
+        <w:tc>
+          <w:tcPr>
+            <w:tcW w:w="2895" w:type="dxa"/>
+            <w:shd w:val="clear" w:color="auto" w:fill="D9E2D5"/>
+          </w:tcPr>
+          <w:p>
+            <w:pPr>
+              <w:spacing w:before="40" w:after="40"/>
+              <w:jc w:val="left"/>
+              <w:rPr>
+                <w:rFonts w:ascii="Arial" w:hAnsi="Arial" w:cs="Arial"/>
+                <w:b/>
+                <w:bCs/>
+                <w:sz w:val="20"/>
+                <w:szCs w:val="20"/>
+              </w:rPr>
+            </w:pPr>
+            <w:r>
+              <w:rPr>
+                <w:rFonts w:ascii="Arial" w:hAnsi="Arial" w:cs="Arial"/>
+                <w:b/>
+                <w:bCs/>
+                <w:sz w:val="20"/>
+                <w:szCs w:val="20"/>
+              </w:rPr>
+              <w:t xml:space="preserve">Dimensão</w:t>
+            </w:r>
+          </w:p>
+        </w:tc>
+        <w:tc>
+          <w:tcPr>
+            <w:tcW w:w="1158" w:type="dxa"/>
+            <w:shd w:val="clear" w:color="auto" w:fill="D9E2D5"/>
+          </w:tcPr>
+          <w:p>
+            <w:pPr>
+              <w:spacing w:before="40" w:after="40"/>
+              <w:jc w:val="right"/>
+              <w:rPr>
+                <w:rFonts w:ascii="Arial" w:hAnsi="Arial" w:cs="Arial"/>
+                <w:b/>
+                <w:bCs/>
+                <w:sz w:val="20"/>
+                <w:szCs w:val="20"/>
+              </w:rPr>
+            </w:pPr>
+            <w:r>
+              <w:rPr>
+                <w:rFonts w:ascii="Arial" w:hAnsi="Arial" w:cs="Arial"/>
+                <w:b/>
+                <w:bCs/>
+                <w:sz w:val="20"/>
+                <w:szCs w:val="20"/>
+              </w:rPr>
+              <w:t xml:space="preserve">Famílias</w:t>
+            </w:r>
+          </w:p>
+        </w:tc>
+        <w:tc>
+          <w:tcPr>
+            <w:tcW w:w="1351" w:type="dxa"/>
+            <w:shd w:val="clear" w:color="auto" w:fill="D9E2D5"/>
+          </w:tcPr>
+          <w:p>
+            <w:pPr>
+              <w:spacing w:before="40" w:after="40"/>
+              <w:jc w:val="right"/>
+              <w:rPr>
+                <w:rFonts w:ascii="Arial" w:hAnsi="Arial" w:cs="Arial"/>
+                <w:b/>
+                <w:bCs/>
+                <w:sz w:val="20"/>
+                <w:szCs w:val="20"/>
+              </w:rPr>
+            </w:pPr>
+            <w:r>
+              <w:rPr>
+                <w:rFonts w:ascii="Arial" w:hAnsi="Arial" w:cs="Arial"/>
+                <w:b/>
+                <w:bCs/>
+                <w:sz w:val="20"/>
+                <w:szCs w:val="20"/>
+              </w:rPr>
+              <w:t xml:space="preserve">Melhoraram</w:t>
+            </w:r>
+          </w:p>
+        </w:tc>
+        <w:tc>
+          <w:tcPr>
+            <w:tcW w:w="965" w:type="dxa"/>
+            <w:shd w:val="clear" w:color="auto" w:fill="D9E2D5"/>
+          </w:tcPr>
+          <w:p>
+            <w:pPr>
+              <w:spacing w:before="40" w:after="40"/>
+              <w:jc w:val="right"/>
+              <w:rPr>
+                <w:rFonts w:ascii="Arial" w:hAnsi="Arial" w:cs="Arial"/>
+                <w:b/>
+                <w:bCs/>
+                <w:sz w:val="20"/>
+                <w:szCs w:val="20"/>
+              </w:rPr>
+            </w:pPr>
+            <w:r>
+              <w:rPr>
+                <w:rFonts w:ascii="Arial" w:hAnsi="Arial" w:cs="Arial"/>
+                <w:b/>
+                <w:bCs/>
+                <w:sz w:val="20"/>
+                <w:szCs w:val="20"/>
+              </w:rPr>
+              <w:t xml:space="preserve">Iguais</w:t>
+            </w:r>
+          </w:p>
+        </w:tc>
+        <w:tc>
+          <w:tcPr>
+            <w:tcW w:w="1158" w:type="dxa"/>
+            <w:shd w:val="clear" w:color="auto" w:fill="D9E2D5"/>
+          </w:tcPr>
+          <w:p>
+            <w:pPr>
+              <w:spacing w:before="40" w:after="40"/>
+              <w:jc w:val="right"/>
+              <w:rPr>
+                <w:rFonts w:ascii="Arial" w:hAnsi="Arial" w:cs="Arial"/>
+                <w:b/>
+                <w:bCs/>
+                <w:sz w:val="20"/>
+                <w:szCs w:val="20"/>
+              </w:rPr>
+            </w:pPr>
+            <w:r>
+              <w:rPr>
+                <w:rFonts w:ascii="Arial" w:hAnsi="Arial" w:cs="Arial"/>
+                <w:b/>
+                <w:bCs/>
+                <w:sz w:val="20"/>
+                <w:szCs w:val="20"/>
+              </w:rPr>
+              <w:t xml:space="preserve">Pioraram</w:t>
+            </w:r>
+          </w:p>
+        </w:tc>
+        <w:tc>
+          <w:tcPr>
+            <w:tcW w:w="1544" w:type="dxa"/>
+            <w:shd w:val="clear" w:color="auto" w:fill="D9E2D5"/>
+          </w:tcPr>
+          <w:p>
+            <w:pPr>
+              <w:spacing w:before="40" w:after="40"/>
+              <w:jc w:val="right"/>
+              <w:rPr>
+                <w:rFonts w:ascii="Arial" w:hAnsi="Arial" w:cs="Arial"/>
+                <w:b/>
+                <w:bCs/>
+                <w:sz w:val="20"/>
+                <w:szCs w:val="20"/>
+              </w:rPr>
+            </w:pPr>
+            <w:r>
+              <w:rPr>
+                <w:rFonts w:ascii="Arial" w:hAnsi="Arial" w:cs="Arial"/>
+                <w:b/>
+                <w:bCs/>
+                <w:sz w:val="20"/>
+                <w:szCs w:val="20"/>
+              </w:rPr>
+              <w:t xml:space="preserve">% que melhoraram</w:t>
+            </w:r>
+          </w:p>
+        </w:tc>
+      </w:tr>
+      <w:tr>
+        <w:trPr>
+          <w:cantSplit/>
+        </w:trPr>
+        <w:tc>
+          <w:tcPr>
+            <w:tcW w:w="2895" w:type="dxa"/>
+          </w:tcPr>
+          <w:p>
+            <w:pPr>
+              <w:spacing w:before="40" w:after="40"/>
+              <w:jc w:val="left"/>
+              <w:rPr>
+                <w:rFonts w:ascii="Arial" w:hAnsi="Arial" w:cs="Arial"/>
+                <w:sz w:val="20"/>
+                <w:szCs w:val="20"/>
+              </w:rPr>
+            </w:pPr>
+            <w:r>
+              <w:rPr>
+                <w:rFonts w:ascii="Arial" w:hAnsi="Arial" w:cs="Arial"/>
+                <w:sz w:val="20"/>
+                <w:szCs w:val="20"/>
+              </w:rPr>
+              <w:t xml:space="preserve">{#progressoDimensoes}{nome}</w:t>
+            </w:r>
+          </w:p>
+        </w:tc>
+        <w:tc>
+          <w:tcPr>
+            <w:tcW w:w="1158" w:type="dxa"/>
+          </w:tcPr>
+          <w:p>
+            <w:pPr>
+              <w:spacing w:before="40" w:after="40"/>
+              <w:jc w:val="right"/>
+              <w:rPr>
+                <w:rFonts w:ascii="Arial" w:hAnsi="Arial" w:cs="Arial"/>
+                <w:sz w:val="20"/>
+                <w:szCs w:val="20"/>
+              </w:rPr>
+            </w:pPr>
+            <w:r>
+              <w:rPr>
+                <w:rFonts w:ascii="Arial" w:hAnsi="Arial" w:cs="Arial"/>
+                <w:sz w:val="20"/>
+                <w:szCs w:val="20"/>
+              </w:rPr>
+              <w:t xml:space="preserve">{familias}</w:t>
+            </w:r>
+          </w:p>
+        </w:tc>
+        <w:tc>
+          <w:tcPr>
+            <w:tcW w:w="1351" w:type="dxa"/>
+          </w:tcPr>
+          <w:p>
+            <w:pPr>
+              <w:spacing w:before="40" w:after="40"/>
+              <w:jc w:val="right"/>
+              <w:rPr>
+                <w:rFonts w:ascii="Arial" w:hAnsi="Arial" w:cs="Arial"/>
+                <w:sz w:val="20"/>
+                <w:szCs w:val="20"/>
+              </w:rPr>
+            </w:pPr>
+            <w:r>
+              <w:rPr>
+                <w:rFonts w:ascii="Arial" w:hAnsi="Arial" w:cs="Arial"/>
+                <w:sz w:val="20"/>
+                <w:szCs w:val="20"/>
+              </w:rPr>
+              <w:t xml:space="preserve">{melhoraram}</w:t>
+            </w:r>
+          </w:p>
+        </w:tc>
+        <w:tc>
+          <w:tcPr>
+            <w:tcW w:w="965" w:type="dxa"/>
+          </w:tcPr>
+          <w:p>
+            <w:pPr>
+              <w:spacing w:before="40" w:after="40"/>
+              <w:jc w:val="right"/>
+              <w:rPr>
+                <w:rFonts w:ascii="Arial" w:hAnsi="Arial" w:cs="Arial"/>
+                <w:sz w:val="20"/>
+                <w:szCs w:val="20"/>
+              </w:rPr>
+            </w:pPr>
+            <w:r>
+              <w:rPr>
+                <w:rFonts w:ascii="Arial" w:hAnsi="Arial" w:cs="Arial"/>
+                <w:sz w:val="20"/>
+                <w:szCs w:val="20"/>
+              </w:rPr>
+              <w:t xml:space="preserve">{iguais}</w:t>
+            </w:r>
+          </w:p>
+        </w:tc>
+        <w:tc>
+          <w:tcPr>
+            <w:tcW w:w="1158" w:type="dxa"/>
+          </w:tcPr>
+          <w:p>
+            <w:pPr>
+              <w:spacing w:before="40" w:after="40"/>
+              <w:jc w:val="right"/>
+              <w:rPr>
+                <w:rFonts w:ascii="Arial" w:hAnsi="Arial" w:cs="Arial"/>
+                <w:sz w:val="20"/>
+                <w:szCs w:val="20"/>
+              </w:rPr>
+            </w:pPr>
+            <w:r>
+              <w:rPr>
+                <w:rFonts w:ascii="Arial" w:hAnsi="Arial" w:cs="Arial"/>
+                <w:sz w:val="20"/>
+                <w:szCs w:val="20"/>
+              </w:rPr>
+              <w:t xml:space="preserve">{pioraram}</w:t>
+            </w:r>
+          </w:p>
+        </w:tc>
+        <w:tc>
+          <w:tcPr>
+            <w:tcW w:w="1544" w:type="dxa"/>
+          </w:tcPr>
+          <w:p>
+            <w:pPr>
+              <w:spacing w:before="40" w:after="40"/>
+              <w:jc w:val="right"/>
+              <w:rPr>
+                <w:rFonts w:ascii="Arial" w:hAnsi="Arial" w:cs="Arial"/>
+                <w:sz w:val="20"/>
+                <w:szCs w:val="20"/>
+              </w:rPr>
+            </w:pPr>
+            <w:r>
+              <w:rPr>
+                <w:rFonts w:ascii="Arial" w:hAnsi="Arial" w:cs="Arial"/>
+                <w:sz w:val="20"/>
+                <w:szCs w:val="20"/>
+              </w:rPr>
+              <w:t xml:space="preserve">{percentual}{/progressoDimensoes}</w:t>
+            </w:r>
+          </w:p>
+        </w:tc>
+      </w:tr>
+    </w:tbl>
+    <w:p>
+      <w:pPr>
+        <w:spacing w:before="0" w:after="120" w:line="240" w:lineRule="auto"/>
+        <w:rPr>
+          <w:rFonts w:ascii="Arial" w:hAnsi="Arial" w:cs="Arial"/>
+          <w:sz w:val="24"/>
+          <w:szCs w:val="24"/>
+        </w:rPr>
+      </w:pPr>
+    </w:p>
+    <w:tbl>
+      <w:tblPr>
+        <w:tblW w:w="9070" w:type="dxa"/>
+        <w:tblBorders>
+          <w:top w:val="single" w:sz="4" w:space="0" w:color="808080"/>
+          <w:left w:val="single" w:sz="4" w:space="0" w:color="808080"/>
+          <w:bottom w:val="single" w:sz="4" w:space="0" w:color="808080"/>
+          <w:right w:val="single" w:sz="4" w:space="0" w:color="808080"/>
+          <w:insideH w:val="single" w:sz="4" w:space="0" w:color="808080"/>
+          <w:insideV w:val="single" w:sz="4" w:space="0" w:color="808080"/>
+        </w:tblBorders>
+        <w:tblLayout w:type="fixed"/>
+        <w:tblCellMar>
+          <w:left w:w="80" w:type="dxa"/>
+          <w:right w:w="80" w:type="dxa"/>
+        </w:tblCellMar>
+      </w:tblPr>
+      <w:tblGrid>
+        <w:gridCol w:w="2155"/>
+        <w:gridCol w:w="988"/>
+        <w:gridCol w:w="988"/>
+        <w:gridCol w:w="898"/>
+        <w:gridCol w:w="898"/>
+        <w:gridCol w:w="1347"/>
+        <w:gridCol w:w="1796"/>
+      </w:tblGrid>
+      <w:tr>
+        <w:trPr>
+          <w:cantSplit/>
+          <w:tblHeader/>
+        </w:trPr>
+        <w:tc>
+          <w:tcPr>
+            <w:tcW w:w="2155" w:type="dxa"/>
+            <w:shd w:val="clear" w:color="auto" w:fill="D9E2D5"/>
+          </w:tcPr>
+          <w:p>
+            <w:pPr>
+              <w:spacing w:before="40" w:after="40"/>
+              <w:jc w:val="left"/>
+              <w:rPr>
+                <w:rFonts w:ascii="Arial" w:hAnsi="Arial" w:cs="Arial"/>
+                <w:b/>
+                <w:bCs/>
+                <w:sz w:val="20"/>
+                <w:szCs w:val="20"/>
+              </w:rPr>
+            </w:pPr>
+            <w:r>
+              <w:rPr>
+                <w:rFonts w:ascii="Arial" w:hAnsi="Arial" w:cs="Arial"/>
+                <w:b/>
+                <w:bCs/>
+                <w:sz w:val="20"/>
+                <w:szCs w:val="20"/>
+              </w:rPr>
+              <w:t xml:space="preserve">Unidade</w:t>
+            </w:r>
+          </w:p>
+        </w:tc>
+        <w:tc>
+          <w:tcPr>
+            <w:tcW w:w="988" w:type="dxa"/>
+            <w:shd w:val="clear" w:color="auto" w:fill="D9E2D5"/>
+          </w:tcPr>
+          <w:p>
+            <w:pPr>
+              <w:spacing w:before="40" w:after="40"/>
+              <w:jc w:val="right"/>
+              <w:rPr>
+                <w:rFonts w:ascii="Arial" w:hAnsi="Arial" w:cs="Arial"/>
+                <w:b/>
+                <w:bCs/>
+                <w:sz w:val="20"/>
+                <w:szCs w:val="20"/>
+              </w:rPr>
+            </w:pPr>
+            <w:r>
+              <w:rPr>
+                <w:rFonts w:ascii="Arial" w:hAnsi="Arial" w:cs="Arial"/>
+                <w:b/>
+                <w:bCs/>
+                <w:sz w:val="20"/>
+                <w:szCs w:val="20"/>
+              </w:rPr>
+              <w:t xml:space="preserve">Famílias</w:t>
+            </w:r>
+          </w:p>
+        </w:tc>
+        <w:tc>
+          <w:tcPr>
+            <w:tcW w:w="988" w:type="dxa"/>
+            <w:shd w:val="clear" w:color="auto" w:fill="D9E2D5"/>
+          </w:tcPr>
+          <w:p>
+            <w:pPr>
+              <w:spacing w:before="40" w:after="40"/>
+              <w:jc w:val="right"/>
+              <w:rPr>
+                <w:rFonts w:ascii="Arial" w:hAnsi="Arial" w:cs="Arial"/>
+                <w:b/>
+                <w:bCs/>
+                <w:sz w:val="20"/>
+                <w:szCs w:val="20"/>
+              </w:rPr>
+            </w:pPr>
+            <w:r>
+              <w:rPr>
+                <w:rFonts w:ascii="Arial" w:hAnsi="Arial" w:cs="Arial"/>
+                <w:b/>
+                <w:bCs/>
+                <w:sz w:val="20"/>
+                <w:szCs w:val="20"/>
+              </w:rPr>
+              <w:t xml:space="preserve">Melhor.</w:t>
+            </w:r>
+          </w:p>
+        </w:tc>
+        <w:tc>
+          <w:tcPr>
+            <w:tcW w:w="898" w:type="dxa"/>
+            <w:shd w:val="clear" w:color="auto" w:fill="D9E2D5"/>
+          </w:tcPr>
+          <w:p>
+            <w:pPr>
+              <w:spacing w:before="40" w:after="40"/>
+              <w:jc w:val="right"/>
+              <w:rPr>
+                <w:rFonts w:ascii="Arial" w:hAnsi="Arial" w:cs="Arial"/>
+                <w:b/>
+                <w:bCs/>
+                <w:sz w:val="20"/>
+                <w:szCs w:val="20"/>
+              </w:rPr>
+            </w:pPr>
+            <w:r>
+              <w:rPr>
+                <w:rFonts w:ascii="Arial" w:hAnsi="Arial" w:cs="Arial"/>
+                <w:b/>
+                <w:bCs/>
+                <w:sz w:val="20"/>
+                <w:szCs w:val="20"/>
+              </w:rPr>
+              <w:t xml:space="preserve">Iguais</w:t>
+            </w:r>
+          </w:p>
+        </w:tc>
+        <w:tc>
+          <w:tcPr>
+            <w:tcW w:w="898" w:type="dxa"/>
+            <w:shd w:val="clear" w:color="auto" w:fill="D9E2D5"/>
+          </w:tcPr>
+          <w:p>
+            <w:pPr>
+              <w:spacing w:before="40" w:after="40"/>
+              <w:jc w:val="right"/>
+              <w:rPr>
+                <w:rFonts w:ascii="Arial" w:hAnsi="Arial" w:cs="Arial"/>
+                <w:b/>
+                <w:bCs/>
+                <w:sz w:val="20"/>
+                <w:szCs w:val="20"/>
+              </w:rPr>
+            </w:pPr>
+            <w:r>
+              <w:rPr>
+                <w:rFonts w:ascii="Arial" w:hAnsi="Arial" w:cs="Arial"/>
+                <w:b/>
+                <w:bCs/>
+                <w:sz w:val="20"/>
+                <w:szCs w:val="20"/>
+              </w:rPr>
+              <w:t xml:space="preserve">Pior.</w:t>
+            </w:r>
+          </w:p>
+        </w:tc>
+        <w:tc>
+          <w:tcPr>
+            <w:tcW w:w="1347" w:type="dxa"/>
+            <w:shd w:val="clear" w:color="auto" w:fill="D9E2D5"/>
+          </w:tcPr>
+          <w:p>
+            <w:pPr>
+              <w:spacing w:before="40" w:after="40"/>
+              <w:jc w:val="right"/>
+              <w:rPr>
+                <w:rFonts w:ascii="Arial" w:hAnsi="Arial" w:cs="Arial"/>
+                <w:b/>
+                <w:bCs/>
+                <w:sz w:val="20"/>
+                <w:szCs w:val="20"/>
+              </w:rPr>
+            </w:pPr>
+            <w:r>
+              <w:rPr>
+                <w:rFonts w:ascii="Arial" w:hAnsi="Arial" w:cs="Arial"/>
+                <w:b/>
+                <w:bCs/>
+                <w:sz w:val="20"/>
+                <w:szCs w:val="20"/>
+              </w:rPr>
+              <w:t xml:space="preserve">% melhoraram</w:t>
+            </w:r>
+          </w:p>
+        </w:tc>
+        <w:tc>
+          <w:tcPr>
+            <w:tcW w:w="1796" w:type="dxa"/>
+            <w:shd w:val="clear" w:color="auto" w:fill="D9E2D5"/>
+          </w:tcPr>
+          <w:p>
+            <w:pPr>
+              <w:spacing w:before="40" w:after="40"/>
+              <w:jc w:val="right"/>
+              <w:rPr>
+                <w:rFonts w:ascii="Arial" w:hAnsi="Arial" w:cs="Arial"/>
+                <w:b/>
+                <w:bCs/>
+                <w:sz w:val="20"/>
+                <w:szCs w:val="20"/>
+              </w:rPr>
+            </w:pPr>
+            <w:r>
+              <w:rPr>
+                <w:rFonts w:ascii="Arial" w:hAnsi="Arial" w:cs="Arial"/>
+                <w:b/>
+                <w:bCs/>
+                <w:sz w:val="20"/>
+                <w:szCs w:val="20"/>
+              </w:rPr>
+              <w:t xml:space="preserve">Índice (inicial → atual)</w:t>
+            </w:r>
+          </w:p>
+        </w:tc>
+      </w:tr>
+      <w:tr>
+        <w:trPr>
+          <w:cantSplit/>
+        </w:trPr>
+        <w:tc>
+          <w:tcPr>
+            <w:tcW w:w="2155" w:type="dxa"/>
+          </w:tcPr>
+          <w:p>
+            <w:pPr>
+              <w:spacing w:before="40" w:after="40"/>
+              <w:jc w:val="left"/>
+              <w:rPr>
+                <w:rFonts w:ascii="Arial" w:hAnsi="Arial" w:cs="Arial"/>
+                <w:sz w:val="20"/>
+                <w:szCs w:val="20"/>
+              </w:rPr>
+            </w:pPr>
+            <w:r>
+              <w:rPr>
+                <w:rFonts w:ascii="Arial" w:hAnsi="Arial" w:cs="Arial"/>
+                <w:sz w:val="20"/>
+                <w:szCs w:val="20"/>
+              </w:rPr>
+              <w:t xml:space="preserve">{#progressoUnidades}{nome}</w:t>
+            </w:r>
+          </w:p>
+        </w:tc>
+        <w:tc>
+          <w:tcPr>
+            <w:tcW w:w="988" w:type="dxa"/>
+          </w:tcPr>
+          <w:p>
+            <w:pPr>
+              <w:spacing w:before="40" w:after="40"/>
+              <w:jc w:val="right"/>
+              <w:rPr>
+                <w:rFonts w:ascii="Arial" w:hAnsi="Arial" w:cs="Arial"/>
+                <w:sz w:val="20"/>
+                <w:szCs w:val="20"/>
+              </w:rPr>
+            </w:pPr>
+            <w:r>
+              <w:rPr>
+                <w:rFonts w:ascii="Arial" w:hAnsi="Arial" w:cs="Arial"/>
+                <w:sz w:val="20"/>
+                <w:szCs w:val="20"/>
+              </w:rPr>
+              <w:t xml:space="preserve">{familias}</w:t>
+            </w:r>
+          </w:p>
+        </w:tc>
+        <w:tc>
+          <w:tcPr>
+            <w:tcW w:w="988" w:type="dxa"/>
+          </w:tcPr>
+          <w:p>
+            <w:pPr>
+              <w:spacing w:before="40" w:after="40"/>
+              <w:jc w:val="right"/>
+              <w:rPr>
+                <w:rFonts w:ascii="Arial" w:hAnsi="Arial" w:cs="Arial"/>
+                <w:sz w:val="20"/>
+                <w:szCs w:val="20"/>
+              </w:rPr>
+            </w:pPr>
+            <w:r>
+              <w:rPr>
+                <w:rFonts w:ascii="Arial" w:hAnsi="Arial" w:cs="Arial"/>
+                <w:sz w:val="20"/>
+                <w:szCs w:val="20"/>
+              </w:rPr>
+              <w:t xml:space="preserve">{melhoraram}</w:t>
+            </w:r>
+          </w:p>
+        </w:tc>
+        <w:tc>
+          <w:tcPr>
+            <w:tcW w:w="898" w:type="dxa"/>
+          </w:tcPr>
+          <w:p>
+            <w:pPr>
+              <w:spacing w:before="40" w:after="40"/>
+              <w:jc w:val="right"/>
+              <w:rPr>
+                <w:rFonts w:ascii="Arial" w:hAnsi="Arial" w:cs="Arial"/>
+                <w:sz w:val="20"/>
+                <w:szCs w:val="20"/>
+              </w:rPr>
+            </w:pPr>
+            <w:r>
+              <w:rPr>
+                <w:rFonts w:ascii="Arial" w:hAnsi="Arial" w:cs="Arial"/>
+                <w:sz w:val="20"/>
+                <w:szCs w:val="20"/>
+              </w:rPr>
+              <w:t xml:space="preserve">{iguais}</w:t>
+            </w:r>
+          </w:p>
+        </w:tc>
+        <w:tc>
+          <w:tcPr>
+            <w:tcW w:w="898" w:type="dxa"/>
+          </w:tcPr>
+          <w:p>
+            <w:pPr>
+              <w:spacing w:before="40" w:after="40"/>
+              <w:jc w:val="right"/>
+              <w:rPr>
+                <w:rFonts w:ascii="Arial" w:hAnsi="Arial" w:cs="Arial"/>
+                <w:sz w:val="20"/>
+                <w:szCs w:val="20"/>
+              </w:rPr>
+            </w:pPr>
+            <w:r>
+              <w:rPr>
+                <w:rFonts w:ascii="Arial" w:hAnsi="Arial" w:cs="Arial"/>
+                <w:sz w:val="20"/>
+                <w:szCs w:val="20"/>
+              </w:rPr>
+              <w:t xml:space="preserve">{pioraram}</w:t>
+            </w:r>
+          </w:p>
+        </w:tc>
+        <w:tc>
+          <w:tcPr>
+            <w:tcW w:w="1347" w:type="dxa"/>
+          </w:tcPr>
+          <w:p>
+            <w:pPr>
+              <w:spacing w:before="40" w:after="40"/>
+              <w:jc w:val="right"/>
+              <w:rPr>
+                <w:rFonts w:ascii="Arial" w:hAnsi="Arial" w:cs="Arial"/>
+                <w:sz w:val="20"/>
+                <w:szCs w:val="20"/>
+              </w:rPr>
+            </w:pPr>
+            <w:r>
+              <w:rPr>
+                <w:rFonts w:ascii="Arial" w:hAnsi="Arial" w:cs="Arial"/>
+                <w:sz w:val="20"/>
+                <w:szCs w:val="20"/>
+              </w:rPr>
+              <w:t xml:space="preserve">{percentual}</w:t>
+            </w:r>
+          </w:p>
+        </w:tc>
+        <w:tc>
+          <w:tcPr>
+            <w:tcW w:w="1796" w:type="dxa"/>
+          </w:tcPr>
+          <w:p>
+            <w:pPr>
+              <w:spacing w:before="40" w:after="40"/>
+              <w:jc w:val="right"/>
+              <w:rPr>
+                <w:rFonts w:ascii="Arial" w:hAnsi="Arial" w:cs="Arial"/>
+                <w:sz w:val="20"/>
+                <w:szCs w:val="20"/>
+              </w:rPr>
+            </w:pPr>
+            <w:r>
+              <w:rPr>
+                <w:rFonts w:ascii="Arial" w:hAnsi="Arial" w:cs="Arial"/>
+                <w:sz w:val="20"/>
+                <w:szCs w:val="20"/>
+              </w:rPr>
+              <w:t xml:space="preserve">{indice}{/progressoUnidades}</w:t>
+            </w:r>
+          </w:p>
+        </w:tc>
+      </w:tr>
+    </w:tbl>
+    <w:p>
+      <w:pPr>
+        <w:spacing w:before="0" w:after="120" w:line="240" w:lineRule="auto"/>
+        <w:rPr>
+          <w:rFonts w:ascii="Arial" w:hAnsi="Arial" w:cs="Arial"/>
+          <w:sz w:val="24"/>
+          <w:szCs w:val="24"/>
+        </w:rPr>
+      </w:pPr>
+    </w:p>
+    <w:p>
+      <w:pPr>
+        <w:spacing w:before="0" w:after="0" w:line="240" w:lineRule="auto"/>
+        <w:rPr>
+          <w:rFonts w:ascii="Arial" w:hAnsi="Arial" w:cs="Arial"/>
+          <w:sz w:val="24"/>
+          <w:szCs w:val="24"/>
+        </w:rPr>
+      </w:pPr>
+      <w:r>
+        <w:rPr>
+          <w:rFonts w:ascii="Arial" w:hAnsi="Arial" w:cs="Arial"/>
+          <w:sz w:val="24"/>
+          <w:szCs w:val="24"/>
+        </w:rPr>
+        <w:t xml:space="preserve">{/temTabelaProgresso}</w:t>
+      </w:r>
+    </w:p>
+    <w:p>
+      <w:pPr>
+        <w:spacing w:before="0" w:after="0" w:line="240" w:lineRule="auto"/>
+        <w:rPr>
+          <w:rFonts w:ascii="Arial" w:hAnsi="Arial" w:cs="Arial"/>
+          <w:sz w:val="24"/>
+          <w:szCs w:val="24"/>
+        </w:rPr>
+      </w:pPr>
+      <w:r>
+        <w:rPr>
+          <w:rFonts w:ascii="Arial" w:hAnsi="Arial" w:cs="Arial"/>
+          <w:sz w:val="24"/>
+          <w:szCs w:val="24"/>
+        </w:rPr>
+        <w:t xml:space="preserve">{#temMetas}</w:t>
+      </w:r>
+    </w:p>
+    <w:p>
+      <w:pPr>
+        <w:keepNext/>
+        <w:spacing w:before="120" w:after="60" w:line="240" w:lineRule="auto"/>
+        <w:rPr>
+          <w:rFonts w:ascii="Arial" w:hAnsi="Arial" w:cs="Arial"/>
+          <w:b/>
+          <w:bCs/>
+          <w:sz w:val="24"/>
+          <w:szCs w:val="24"/>
+        </w:rPr>
+      </w:pPr>
+      <w:r>
+        <w:rPr>
+          <w:rFonts w:ascii="Arial" w:hAnsi="Arial" w:cs="Arial"/>
+          <w:b/>
+          <w:bCs/>
+          <w:sz w:val="24"/>
+          <w:szCs w:val="24"/>
+        </w:rPr>
+        <w:t xml:space="preserve">Metas das famílias</w:t>
+      </w:r>
+    </w:p>
+    <w:tbl>
+      <w:tblPr>
+        <w:tblW w:w="9070" w:type="dxa"/>
+        <w:tblBorders>
+          <w:top w:val="single" w:sz="4" w:space="0" w:color="808080"/>
+          <w:left w:val="single" w:sz="4" w:space="0" w:color="808080"/>
+          <w:bottom w:val="single" w:sz="4" w:space="0" w:color="808080"/>
+          <w:right w:val="single" w:sz="4" w:space="0" w:color="808080"/>
+          <w:insideH w:val="single" w:sz="4" w:space="0" w:color="808080"/>
+          <w:insideV w:val="single" w:sz="4" w:space="0" w:color="808080"/>
+        </w:tblBorders>
+        <w:tblLayout w:type="fixed"/>
+        <w:tblCellMar>
+          <w:left w:w="80" w:type="dxa"/>
+          <w:right w:w="80" w:type="dxa"/>
+        </w:tblCellMar>
+      </w:tblPr>
+      <w:tblGrid>
+        <w:gridCol w:w="2563"/>
+        <w:gridCol w:w="986"/>
+        <w:gridCol w:w="1479"/>
+        <w:gridCol w:w="1282"/>
+        <w:gridCol w:w="1479"/>
+        <w:gridCol w:w="1282"/>
+      </w:tblGrid>
+      <w:tr>
+        <w:trPr>
+          <w:cantSplit/>
+          <w:tblHeader/>
+        </w:trPr>
+        <w:tc>
+          <w:tcPr>
+            <w:tcW w:w="2563" w:type="dxa"/>
+            <w:shd w:val="clear" w:color="auto" w:fill="D9E2D5"/>
+          </w:tcPr>
+          <w:p>
+            <w:pPr>
+              <w:spacing w:before="40" w:after="40"/>
+              <w:jc w:val="left"/>
+              <w:rPr>
+                <w:rFonts w:ascii="Arial" w:hAnsi="Arial" w:cs="Arial"/>
+                <w:b/>
+                <w:bCs/>
+                <w:sz w:val="20"/>
+                <w:szCs w:val="20"/>
+              </w:rPr>
+            </w:pPr>
+            <w:r>
+              <w:rPr>
+                <w:rFonts w:ascii="Arial" w:hAnsi="Arial" w:cs="Arial"/>
+                <w:b/>
+                <w:bCs/>
+                <w:sz w:val="20"/>
+                <w:szCs w:val="20"/>
+              </w:rPr>
+              <w:t xml:space="preserve">Dimensão</w:t>
+            </w:r>
+          </w:p>
+        </w:tc>
+        <w:tc>
+          <w:tcPr>
+            <w:tcW w:w="986" w:type="dxa"/>
+            <w:shd w:val="clear" w:color="auto" w:fill="D9E2D5"/>
+          </w:tcPr>
+          <w:p>
+            <w:pPr>
+              <w:spacing w:before="40" w:after="40"/>
+              <w:jc w:val="right"/>
+              <w:rPr>
+                <w:rFonts w:ascii="Arial" w:hAnsi="Arial" w:cs="Arial"/>
+                <w:b/>
+                <w:bCs/>
+                <w:sz w:val="20"/>
+                <w:szCs w:val="20"/>
+              </w:rPr>
+            </w:pPr>
+            <w:r>
+              <w:rPr>
+                <w:rFonts w:ascii="Arial" w:hAnsi="Arial" w:cs="Arial"/>
+                <w:b/>
+                <w:bCs/>
+                <w:sz w:val="20"/>
+                <w:szCs w:val="20"/>
+              </w:rPr>
+              <w:t xml:space="preserve">Metas</w:t>
+            </w:r>
+          </w:p>
+        </w:tc>
+        <w:tc>
+          <w:tcPr>
+            <w:tcW w:w="1479" w:type="dxa"/>
+            <w:shd w:val="clear" w:color="auto" w:fill="D9E2D5"/>
+          </w:tcPr>
+          <w:p>
+            <w:pPr>
+              <w:spacing w:before="40" w:after="40"/>
+              <w:jc w:val="right"/>
+              <w:rPr>
+                <w:rFonts w:ascii="Arial" w:hAnsi="Arial" w:cs="Arial"/>
+                <w:b/>
+                <w:bCs/>
+                <w:sz w:val="20"/>
+                <w:szCs w:val="20"/>
+              </w:rPr>
+            </w:pPr>
+            <w:r>
+              <w:rPr>
+                <w:rFonts w:ascii="Arial" w:hAnsi="Arial" w:cs="Arial"/>
+                <w:b/>
+                <w:bCs/>
+                <w:sz w:val="20"/>
+                <w:szCs w:val="20"/>
+              </w:rPr>
+              <w:t xml:space="preserve">Em andamento</w:t>
+            </w:r>
+          </w:p>
+        </w:tc>
+        <w:tc>
+          <w:tcPr>
+            <w:tcW w:w="1282" w:type="dxa"/>
+            <w:shd w:val="clear" w:color="auto" w:fill="D9E2D5"/>
+          </w:tcPr>
+          <w:p>
+            <w:pPr>
+              <w:spacing w:before="40" w:after="40"/>
+              <w:jc w:val="right"/>
+              <w:rPr>
+                <w:rFonts w:ascii="Arial" w:hAnsi="Arial" w:cs="Arial"/>
+                <w:b/>
+                <w:bCs/>
+                <w:sz w:val="20"/>
+                <w:szCs w:val="20"/>
+              </w:rPr>
+            </w:pPr>
+            <w:r>
+              <w:rPr>
+                <w:rFonts w:ascii="Arial" w:hAnsi="Arial" w:cs="Arial"/>
+                <w:b/>
+                <w:bCs/>
+                <w:sz w:val="20"/>
+                <w:szCs w:val="20"/>
+              </w:rPr>
+              <w:t xml:space="preserve">Atingidas</w:t>
+            </w:r>
+          </w:p>
+        </w:tc>
+        <w:tc>
+          <w:tcPr>
+            <w:tcW w:w="1479" w:type="dxa"/>
+            <w:shd w:val="clear" w:color="auto" w:fill="D9E2D5"/>
+          </w:tcPr>
+          <w:p>
+            <w:pPr>
+              <w:spacing w:before="40" w:after="40"/>
+              <w:jc w:val="right"/>
+              <w:rPr>
+                <w:rFonts w:ascii="Arial" w:hAnsi="Arial" w:cs="Arial"/>
+                <w:b/>
+                <w:bCs/>
+                <w:sz w:val="20"/>
+                <w:szCs w:val="20"/>
+              </w:rPr>
+            </w:pPr>
+            <w:r>
+              <w:rPr>
+                <w:rFonts w:ascii="Arial" w:hAnsi="Arial" w:cs="Arial"/>
+                <w:b/>
+                <w:bCs/>
+                <w:sz w:val="20"/>
+                <w:szCs w:val="20"/>
+              </w:rPr>
+              <w:t xml:space="preserve">Não atingidas</w:t>
+            </w:r>
+          </w:p>
+        </w:tc>
+        <w:tc>
+          <w:tcPr>
+            <w:tcW w:w="1282" w:type="dxa"/>
+            <w:shd w:val="clear" w:color="auto" w:fill="D9E2D5"/>
+          </w:tcPr>
+          <w:p>
+            <w:pPr>
+              <w:spacing w:before="40" w:after="40"/>
+              <w:jc w:val="right"/>
+              <w:rPr>
+                <w:rFonts w:ascii="Arial" w:hAnsi="Arial" w:cs="Arial"/>
+                <w:b/>
+                <w:bCs/>
+                <w:sz w:val="20"/>
+                <w:szCs w:val="20"/>
+              </w:rPr>
+            </w:pPr>
+            <w:r>
+              <w:rPr>
+                <w:rFonts w:ascii="Arial" w:hAnsi="Arial" w:cs="Arial"/>
+                <w:b/>
+                <w:bCs/>
+                <w:sz w:val="20"/>
+                <w:szCs w:val="20"/>
+              </w:rPr>
+              <w:t xml:space="preserve">Canceladas</w:t>
+            </w:r>
+          </w:p>
+        </w:tc>
+      </w:tr>
+      <w:tr>
+        <w:trPr>
+          <w:cantSplit/>
+        </w:trPr>
+        <w:tc>
+          <w:tcPr>
+            <w:tcW w:w="2563" w:type="dxa"/>
+          </w:tcPr>
+          <w:p>
+            <w:pPr>
+              <w:spacing w:before="40" w:after="40"/>
+              <w:jc w:val="left"/>
+              <w:rPr>
+                <w:rFonts w:ascii="Arial" w:hAnsi="Arial" w:cs="Arial"/>
+                <w:sz w:val="20"/>
+                <w:szCs w:val="20"/>
+              </w:rPr>
+            </w:pPr>
+            <w:r>
+              <w:rPr>
+                <w:rFonts w:ascii="Arial" w:hAnsi="Arial" w:cs="Arial"/>
+                <w:sz w:val="20"/>
+                <w:szCs w:val="20"/>
+              </w:rPr>
+              <w:t xml:space="preserve">{#metasDimensoes}{nome}</w:t>
+            </w:r>
+          </w:p>
+        </w:tc>
+        <w:tc>
+          <w:tcPr>
+            <w:tcW w:w="986" w:type="dxa"/>
+          </w:tcPr>
+          <w:p>
+            <w:pPr>
+              <w:spacing w:before="40" w:after="40"/>
+              <w:jc w:val="right"/>
+              <w:rPr>
+                <w:rFonts w:ascii="Arial" w:hAnsi="Arial" w:cs="Arial"/>
+                <w:sz w:val="20"/>
+                <w:szCs w:val="20"/>
+              </w:rPr>
+            </w:pPr>
+            <w:r>
+              <w:rPr>
+                <w:rFonts w:ascii="Arial" w:hAnsi="Arial" w:cs="Arial"/>
+                <w:sz w:val="20"/>
+                <w:szCs w:val="20"/>
+              </w:rPr>
+              <w:t xml:space="preserve">{total}</w:t>
+            </w:r>
+          </w:p>
+        </w:tc>
+        <w:tc>
+          <w:tcPr>
+            <w:tcW w:w="1479" w:type="dxa"/>
+          </w:tcPr>
+          <w:p>
+            <w:pPr>
+              <w:spacing w:before="40" w:after="40"/>
+              <w:jc w:val="right"/>
+              <w:rPr>
+                <w:rFonts w:ascii="Arial" w:hAnsi="Arial" w:cs="Arial"/>
+                <w:sz w:val="20"/>
+                <w:szCs w:val="20"/>
+              </w:rPr>
+            </w:pPr>
+            <w:r>
+              <w:rPr>
+                <w:rFonts w:ascii="Arial" w:hAnsi="Arial" w:cs="Arial"/>
+                <w:sz w:val="20"/>
+                <w:szCs w:val="20"/>
+              </w:rPr>
+              <w:t xml:space="preserve">{emAndamento}</w:t>
+            </w:r>
+          </w:p>
+        </w:tc>
+        <w:tc>
+          <w:tcPr>
+            <w:tcW w:w="1282" w:type="dxa"/>
+          </w:tcPr>
+          <w:p>
+            <w:pPr>
+              <w:spacing w:before="40" w:after="40"/>
+              <w:jc w:val="right"/>
+              <w:rPr>
+                <w:rFonts w:ascii="Arial" w:hAnsi="Arial" w:cs="Arial"/>
+                <w:sz w:val="20"/>
+                <w:szCs w:val="20"/>
+              </w:rPr>
+            </w:pPr>
+            <w:r>
+              <w:rPr>
+                <w:rFonts w:ascii="Arial" w:hAnsi="Arial" w:cs="Arial"/>
+                <w:sz w:val="20"/>
+                <w:szCs w:val="20"/>
+              </w:rPr>
+              <w:t xml:space="preserve">{atingidas}</w:t>
+            </w:r>
+          </w:p>
+        </w:tc>
+        <w:tc>
+          <w:tcPr>
+            <w:tcW w:w="1479" w:type="dxa"/>
+          </w:tcPr>
+          <w:p>
+            <w:pPr>
+              <w:spacing w:before="40" w:after="40"/>
+              <w:jc w:val="right"/>
+              <w:rPr>
+                <w:rFonts w:ascii="Arial" w:hAnsi="Arial" w:cs="Arial"/>
+                <w:sz w:val="20"/>
+                <w:szCs w:val="20"/>
+              </w:rPr>
+            </w:pPr>
+            <w:r>
+              <w:rPr>
+                <w:rFonts w:ascii="Arial" w:hAnsi="Arial" w:cs="Arial"/>
+                <w:sz w:val="20"/>
+                <w:szCs w:val="20"/>
+              </w:rPr>
+              <w:t xml:space="preserve">{naoAtingidas}</w:t>
+            </w:r>
+          </w:p>
+        </w:tc>
+        <w:tc>
+          <w:tcPr>
+            <w:tcW w:w="1282" w:type="dxa"/>
+          </w:tcPr>
+          <w:p>
+            <w:pPr>
+              <w:spacing w:before="40" w:after="40"/>
+              <w:jc w:val="right"/>
+              <w:rPr>
+                <w:rFonts w:ascii="Arial" w:hAnsi="Arial" w:cs="Arial"/>
+                <w:sz w:val="20"/>
+                <w:szCs w:val="20"/>
+              </w:rPr>
+            </w:pPr>
+            <w:r>
+              <w:rPr>
+                <w:rFonts w:ascii="Arial" w:hAnsi="Arial" w:cs="Arial"/>
+                <w:sz w:val="20"/>
+                <w:szCs w:val="20"/>
+              </w:rPr>
+              <w:t xml:space="preserve">{canceladas}{/metasDimensoes}</w:t>
+            </w:r>
+          </w:p>
+        </w:tc>
+      </w:tr>
+    </w:tbl>
+    <w:p>
+      <w:pPr>
+        <w:spacing w:before="0" w:after="120" w:line="240" w:lineRule="auto"/>
+        <w:rPr>
+          <w:rFonts w:ascii="Arial" w:hAnsi="Arial" w:cs="Arial"/>
+          <w:sz w:val="24"/>
+          <w:szCs w:val="24"/>
+        </w:rPr>
+      </w:pPr>
+    </w:p>
+    <w:p>
+      <w:pPr>
+        <w:spacing w:before="0" w:after="0" w:line="240" w:lineRule="auto"/>
+        <w:rPr>
+          <w:rFonts w:ascii="Arial" w:hAnsi="Arial" w:cs="Arial"/>
+          <w:sz w:val="24"/>
+          <w:szCs w:val="24"/>
+        </w:rPr>
+      </w:pPr>
+      <w:r>
+        <w:rPr>
+          <w:rFonts w:ascii="Arial" w:hAnsi="Arial" w:cs="Arial"/>
+          <w:sz w:val="24"/>
+          <w:szCs w:val="24"/>
+        </w:rPr>
+        <w:t xml:space="preserve">{/temMetas}</w:t>
+      </w:r>
+    </w:p>
+    <w:p>
+      <w:pPr>
+        <w:spacing w:before="0" w:after="0" w:line="240" w:lineRule="auto"/>
+        <w:rPr>
+          <w:rFonts w:ascii="Arial" w:hAnsi="Arial" w:cs="Arial"/>
+          <w:sz w:val="24"/>
+          <w:szCs w:val="24"/>
+        </w:rPr>
+      </w:pPr>
+      <w:r>
+        <w:rPr>
+          <w:rFonts w:ascii="Arial" w:hAnsi="Arial" w:cs="Arial"/>
+          <w:sz w:val="24"/>
+          <w:szCs w:val="24"/>
+        </w:rPr>
+        <w:t xml:space="preserve">{/temProgresso}</w:t>
+      </w:r>
+    </w:p>
+    <w:p>
+      <w:pPr>
+        <w:spacing w:before="0" w:after="0" w:line="240" w:lineRule="auto"/>
+        <w:rPr>
+          <w:rFonts w:ascii="Arial" w:hAnsi="Arial" w:cs="Arial"/>
+          <w:sz w:val="24"/>
+          <w:szCs w:val="24"/>
+        </w:rPr>
+      </w:pPr>
+      <w:r>
+        <w:rPr>
+          <w:rFonts w:ascii="Arial" w:hAnsi="Arial" w:cs="Arial"/>
+          <w:sz w:val="24"/>
+          <w:szCs w:val="24"/>
+        </w:rPr>
+        <w:t xml:space="preserve">{#temSatisfacao}</w:t>
+      </w:r>
+    </w:p>
+    <w:p>
+      <w:pPr>
+        <w:keepNext/>
+        <w:spacing w:before="240" w:after="120" w:line="240" w:lineRule="auto"/>
+        <w:rPr>
+          <w:rFonts w:ascii="Arial" w:hAnsi="Arial" w:cs="Arial"/>
+          <w:b/>
+          <w:bCs/>
+          <w:sz w:val="24"/>
+          <w:szCs w:val="24"/>
+        </w:rPr>
+      </w:pPr>
+      <w:r>
+        <w:rPr>
+          <w:rFonts w:ascii="Arial" w:hAnsi="Arial" w:cs="Arial"/>
+          <w:b/>
+          <w:bCs/>
+          <w:sz w:val="24"/>
+          <w:szCs w:val="24"/>
+        </w:rPr>
+        <w:t xml:space="preserve">5. Satisfação das famílias</w:t>
+      </w:r>
+    </w:p>
+    <w:p>
+      <w:pPr>
+        <w:spacing w:before="0" w:after="0" w:line="240" w:lineRule="auto"/>
+        <w:rPr>
+          <w:rFonts w:ascii="Arial" w:hAnsi="Arial" w:cs="Arial"/>
+          <w:sz w:val="24"/>
+          <w:szCs w:val="24"/>
+        </w:rPr>
+      </w:pPr>
+      <w:r>
+        <w:rPr>
+          <w:rFonts w:ascii="Arial" w:hAnsi="Arial" w:cs="Arial"/>
+          <w:sz w:val="24"/>
+          <w:szCs w:val="24"/>
+        </w:rPr>
+        <w:t xml:space="preserve">{#satisfacao}</w:t>
+      </w:r>
+    </w:p>
+    <w:p>
+      <w:pPr>
+        <w:spacing w:before="0" w:after="120" w:line="360" w:lineRule="auto"/>
+        <w:jc w:val="both"/>
+        <w:rPr>
+          <w:rFonts w:ascii="Arial" w:hAnsi="Arial" w:cs="Arial"/>
+          <w:sz w:val="24"/>
+          <w:szCs w:val="24"/>
+        </w:rPr>
+      </w:pPr>
+      <w:r>
+        <w:rPr>
+          <w:rFonts w:ascii="Arial" w:hAnsi="Arial" w:cs="Arial"/>
+          <w:sz w:val="24"/>
+          <w:szCs w:val="24"/>
+        </w:rPr>
+        <w:t xml:space="preserve">{.}</w:t>
+      </w:r>
+    </w:p>
+    <w:p>
+      <w:pPr>
+        <w:spacing w:before="0" w:after="0" w:line="240" w:lineRule="auto"/>
+        <w:rPr>
+          <w:rFonts w:ascii="Arial" w:hAnsi="Arial" w:cs="Arial"/>
+          <w:sz w:val="24"/>
+          <w:szCs w:val="24"/>
+        </w:rPr>
+      </w:pPr>
+      <w:r>
+        <w:rPr>
+          <w:rFonts w:ascii="Arial" w:hAnsi="Arial" w:cs="Arial"/>
+          <w:sz w:val="24"/>
+          <w:szCs w:val="24"/>
+        </w:rPr>
+        <w:t xml:space="preserve">{/satisfacao}</w:t>
+      </w:r>
+    </w:p>
+    <w:p>
+      <w:pPr>
+        <w:spacing w:before="0" w:after="0" w:line="240" w:lineRule="auto"/>
+        <w:rPr>
+          <w:rFonts w:ascii="Arial" w:hAnsi="Arial" w:cs="Arial"/>
+          <w:sz w:val="24"/>
+          <w:szCs w:val="24"/>
+        </w:rPr>
+      </w:pPr>
+      <w:r>
+        <w:rPr>
+          <w:rFonts w:ascii="Arial" w:hAnsi="Arial" w:cs="Arial"/>
+          <w:sz w:val="24"/>
+          <w:szCs w:val="24"/>
+        </w:rPr>
+        <w:t xml:space="preserve">{#temTabelaSatisfacao}</w:t>
+      </w:r>
+    </w:p>
+    <w:p>
+      <w:pPr>
+        <w:keepNext/>
+        <w:spacing w:before="120" w:after="60" w:line="240" w:lineRule="auto"/>
+        <w:rPr>
+          <w:rFonts w:ascii="Arial" w:hAnsi="Arial" w:cs="Arial"/>
+          <w:b/>
+          <w:bCs/>
+          <w:sz w:val="24"/>
+          <w:szCs w:val="24"/>
+        </w:rPr>
+      </w:pPr>
+      <w:r>
+        <w:rPr>
+          <w:rFonts w:ascii="Arial" w:hAnsi="Arial" w:cs="Arial"/>
+          <w:b/>
+          <w:bCs/>
+          <w:sz w:val="24"/>
+          <w:szCs w:val="24"/>
+        </w:rPr>
+        <w:t xml:space="preserve">Concordância por afirmação</w:t>
+      </w:r>
+    </w:p>
+    <w:tbl>
+      <w:tblPr>
+        <w:tblW w:w="9070" w:type="dxa"/>
+        <w:tblBorders>
+          <w:top w:val="single" w:sz="4" w:space="0" w:color="808080"/>
+          <w:left w:val="single" w:sz="4" w:space="0" w:color="808080"/>
+          <w:bottom w:val="single" w:sz="4" w:space="0" w:color="808080"/>
+          <w:right w:val="single" w:sz="4" w:space="0" w:color="808080"/>
+          <w:insideH w:val="single" w:sz="4" w:space="0" w:color="808080"/>
+          <w:insideV w:val="single" w:sz="4" w:space="0" w:color="808080"/>
+        </w:tblBorders>
+        <w:tblLayout w:type="fixed"/>
+        <w:tblCellMar>
+          <w:left w:w="80" w:type="dxa"/>
+          <w:right w:w="80" w:type="dxa"/>
+        </w:tblCellMar>
+      </w:tblPr>
+      <w:tblGrid>
+        <w:gridCol w:w="4796"/>
+        <w:gridCol w:w="1251"/>
+        <w:gridCol w:w="1564"/>
+        <w:gridCol w:w="1460"/>
+      </w:tblGrid>
+      <w:tr>
+        <w:trPr>
+          <w:cantSplit/>
+          <w:tblHeader/>
+        </w:trPr>
+        <w:tc>
+          <w:tcPr>
+            <w:tcW w:w="4796" w:type="dxa"/>
+            <w:shd w:val="clear" w:color="auto" w:fill="D9E2D5"/>
+          </w:tcPr>
+          <w:p>
+            <w:pPr>
+              <w:spacing w:before="40" w:after="40"/>
+              <w:jc w:val="left"/>
+              <w:rPr>
+                <w:rFonts w:ascii="Arial" w:hAnsi="Arial" w:cs="Arial"/>
+                <w:b/>
+                <w:bCs/>
+                <w:sz w:val="20"/>
+                <w:szCs w:val="20"/>
+              </w:rPr>
+            </w:pPr>
+            <w:r>
+              <w:rPr>
+                <w:rFonts w:ascii="Arial" w:hAnsi="Arial" w:cs="Arial"/>
+                <w:b/>
+                <w:bCs/>
+                <w:sz w:val="20"/>
+                <w:szCs w:val="20"/>
+              </w:rPr>
+              <w:t xml:space="preserve">Afirmação</w:t>
+            </w:r>
+          </w:p>
+        </w:tc>
+        <w:tc>
+          <w:tcPr>
+            <w:tcW w:w="1251" w:type="dxa"/>
+            <w:shd w:val="clear" w:color="auto" w:fill="D9E2D5"/>
+          </w:tcPr>
+          <w:p>
+            <w:pPr>
+              <w:spacing w:before="40" w:after="40"/>
+              <w:jc w:val="right"/>
+              <w:rPr>
+                <w:rFonts w:ascii="Arial" w:hAnsi="Arial" w:cs="Arial"/>
+                <w:b/>
+                <w:bCs/>
+                <w:sz w:val="20"/>
+                <w:szCs w:val="20"/>
+              </w:rPr>
+            </w:pPr>
+            <w:r>
+              <w:rPr>
+                <w:rFonts w:ascii="Arial" w:hAnsi="Arial" w:cs="Arial"/>
+                <w:b/>
+                <w:bCs/>
+                <w:sz w:val="20"/>
+                <w:szCs w:val="20"/>
+              </w:rPr>
+              <w:t xml:space="preserve">Respostas</w:t>
+            </w:r>
+          </w:p>
+        </w:tc>
+        <w:tc>
+          <w:tcPr>
+            <w:tcW w:w="1564" w:type="dxa"/>
+            <w:shd w:val="clear" w:color="auto" w:fill="D9E2D5"/>
+          </w:tcPr>
+          <w:p>
+            <w:pPr>
+              <w:spacing w:before="40" w:after="40"/>
+              <w:jc w:val="right"/>
+              <w:rPr>
+                <w:rFonts w:ascii="Arial" w:hAnsi="Arial" w:cs="Arial"/>
+                <w:b/>
+                <w:bCs/>
+                <w:sz w:val="20"/>
+                <w:szCs w:val="20"/>
+              </w:rPr>
+            </w:pPr>
+            <w:r>
+              <w:rPr>
+                <w:rFonts w:ascii="Arial" w:hAnsi="Arial" w:cs="Arial"/>
+                <w:b/>
+                <w:bCs/>
+                <w:sz w:val="20"/>
+                <w:szCs w:val="20"/>
+              </w:rPr>
+              <w:t xml:space="preserve">Concordância</w:t>
+            </w:r>
+          </w:p>
+        </w:tc>
+        <w:tc>
+          <w:tcPr>
+            <w:tcW w:w="1460" w:type="dxa"/>
+            <w:shd w:val="clear" w:color="auto" w:fill="D9E2D5"/>
+          </w:tcPr>
+          <w:p>
+            <w:pPr>
+              <w:spacing w:before="40" w:after="40"/>
+              <w:jc w:val="right"/>
+              <w:rPr>
+                <w:rFonts w:ascii="Arial" w:hAnsi="Arial" w:cs="Arial"/>
+                <w:b/>
+                <w:bCs/>
+                <w:sz w:val="20"/>
+                <w:szCs w:val="20"/>
+              </w:rPr>
+            </w:pPr>
+            <w:r>
+              <w:rPr>
+                <w:rFonts w:ascii="Arial" w:hAnsi="Arial" w:cs="Arial"/>
+                <w:b/>
+                <w:bCs/>
+                <w:sz w:val="20"/>
+                <w:szCs w:val="20"/>
+              </w:rPr>
+              <w:t xml:space="preserve">Média (1 a 5)</w:t>
+            </w:r>
+          </w:p>
+        </w:tc>
+      </w:tr>
+      <w:tr>
+        <w:trPr>
+          <w:cantSplit/>
+        </w:trPr>
+        <w:tc>
+          <w:tcPr>
+            <w:tcW w:w="4796" w:type="dxa"/>
+          </w:tcPr>
+          <w:p>
+            <w:pPr>
+              <w:spacing w:before="40" w:after="40"/>
+              <w:jc w:val="left"/>
+              <w:rPr>
+                <w:rFonts w:ascii="Arial" w:hAnsi="Arial" w:cs="Arial"/>
+                <w:sz w:val="20"/>
+                <w:szCs w:val="20"/>
+              </w:rPr>
+            </w:pPr>
+            <w:r>
+              <w:rPr>
+                <w:rFonts w:ascii="Arial" w:hAnsi="Arial" w:cs="Arial"/>
+                <w:sz w:val="20"/>
+                <w:szCs w:val="20"/>
+              </w:rPr>
+              <w:t xml:space="preserve">{#satisfacaoPerguntas}{nome}</w:t>
+            </w:r>
+          </w:p>
+        </w:tc>
+        <w:tc>
+          <w:tcPr>
+            <w:tcW w:w="1251" w:type="dxa"/>
+          </w:tcPr>
+          <w:p>
+            <w:pPr>
+              <w:spacing w:before="40" w:after="40"/>
+              <w:jc w:val="right"/>
+              <w:rPr>
+                <w:rFonts w:ascii="Arial" w:hAnsi="Arial" w:cs="Arial"/>
+                <w:sz w:val="20"/>
+                <w:szCs w:val="20"/>
+              </w:rPr>
+            </w:pPr>
+            <w:r>
+              <w:rPr>
+                <w:rFonts w:ascii="Arial" w:hAnsi="Arial" w:cs="Arial"/>
+                <w:sz w:val="20"/>
+                <w:szCs w:val="20"/>
+              </w:rPr>
+              <w:t xml:space="preserve">{respostas}</w:t>
+            </w:r>
+          </w:p>
+        </w:tc>
+        <w:tc>
+          <w:tcPr>
+            <w:tcW w:w="1564" w:type="dxa"/>
+          </w:tcPr>
+          <w:p>
+            <w:pPr>
+              <w:spacing w:before="40" w:after="40"/>
+              <w:jc w:val="right"/>
+              <w:rPr>
+                <w:rFonts w:ascii="Arial" w:hAnsi="Arial" w:cs="Arial"/>
+                <w:sz w:val="20"/>
+                <w:szCs w:val="20"/>
+              </w:rPr>
+            </w:pPr>
+            <w:r>
+              <w:rPr>
+                <w:rFonts w:ascii="Arial" w:hAnsi="Arial" w:cs="Arial"/>
+                <w:sz w:val="20"/>
+                <w:szCs w:val="20"/>
+              </w:rPr>
+              <w:t xml:space="preserve">{concordancia}</w:t>
+            </w:r>
+          </w:p>
+        </w:tc>
+        <w:tc>
+          <w:tcPr>
+            <w:tcW w:w="1460" w:type="dxa"/>
+          </w:tcPr>
+          <w:p>
+            <w:pPr>
+              <w:spacing w:before="40" w:after="40"/>
+              <w:jc w:val="right"/>
+              <w:rPr>
+                <w:rFonts w:ascii="Arial" w:hAnsi="Arial" w:cs="Arial"/>
+                <w:sz w:val="20"/>
+                <w:szCs w:val="20"/>
+              </w:rPr>
+            </w:pPr>
+            <w:r>
+              <w:rPr>
+                <w:rFonts w:ascii="Arial" w:hAnsi="Arial" w:cs="Arial"/>
+                <w:sz w:val="20"/>
+                <w:szCs w:val="20"/>
+              </w:rPr>
+              <w:t xml:space="preserve">{media}{/satisfacaoPerguntas}</w:t>
+            </w:r>
+          </w:p>
+        </w:tc>
+      </w:tr>
+    </w:tbl>
+    <w:p>
+      <w:pPr>
+        <w:spacing w:before="0" w:after="120" w:line="240" w:lineRule="auto"/>
+        <w:rPr>
+          <w:rFonts w:ascii="Arial" w:hAnsi="Arial" w:cs="Arial"/>
+          <w:sz w:val="24"/>
+          <w:szCs w:val="24"/>
+        </w:rPr>
+      </w:pPr>
+    </w:p>
+    <w:p>
+      <w:pPr>
+        <w:spacing w:before="0" w:after="0" w:line="240" w:lineRule="auto"/>
+        <w:rPr>
+          <w:rFonts w:ascii="Arial" w:hAnsi="Arial" w:cs="Arial"/>
+          <w:sz w:val="24"/>
+          <w:szCs w:val="24"/>
+        </w:rPr>
+      </w:pPr>
+      <w:r>
+        <w:rPr>
+          <w:rFonts w:ascii="Arial" w:hAnsi="Arial" w:cs="Arial"/>
+          <w:sz w:val="24"/>
+          <w:szCs w:val="24"/>
+        </w:rPr>
+        <w:t xml:space="preserve">{/temTabelaSatisfacao}</w:t>
+      </w:r>
+    </w:p>
+    <w:p>
+      <w:pPr>
+        <w:keepNext/>
+        <w:spacing w:before="120" w:after="60" w:line="240" w:lineRule="auto"/>
+        <w:rPr>
+          <w:rFonts w:ascii="Arial" w:hAnsi="Arial" w:cs="Arial"/>
+          <w:b/>
+          <w:bCs/>
+          <w:sz w:val="24"/>
+          <w:szCs w:val="24"/>
+        </w:rPr>
+      </w:pPr>
+      <w:r>
+        <w:rPr>
+          <w:rFonts w:ascii="Arial" w:hAnsi="Arial" w:cs="Arial"/>
+          <w:b/>
+          <w:bCs/>
+          <w:sz w:val="24"/>
+          <w:szCs w:val="24"/>
+        </w:rPr>
+        <w:t xml:space="preserve">Por unidade</w:t>
+      </w:r>
+    </w:p>
+    <w:tbl>
+      <w:tblPr>
+        <w:tblW w:w="9070" w:type="dxa"/>
+        <w:tblBorders>
+          <w:top w:val="single" w:sz="4" w:space="0" w:color="808080"/>
+          <w:left w:val="single" w:sz="4" w:space="0" w:color="808080"/>
+          <w:bottom w:val="single" w:sz="4" w:space="0" w:color="808080"/>
+          <w:right w:val="single" w:sz="4" w:space="0" w:color="808080"/>
+          <w:insideH w:val="single" w:sz="4" w:space="0" w:color="808080"/>
+          <w:insideV w:val="single" w:sz="4" w:space="0" w:color="808080"/>
+        </w:tblBorders>
+        <w:tblLayout w:type="fixed"/>
+        <w:tblCellMar>
+          <w:left w:w="80" w:type="dxa"/>
+          <w:right w:w="80" w:type="dxa"/>
+        </w:tblCellMar>
+      </w:tblPr>
+      <w:tblGrid>
+        <w:gridCol w:w="2591"/>
+        <w:gridCol w:w="1196"/>
+        <w:gridCol w:w="1096"/>
+        <w:gridCol w:w="1595"/>
+        <w:gridCol w:w="1296"/>
+        <w:gridCol w:w="1296"/>
+      </w:tblGrid>
+      <w:tr>
+        <w:trPr>
+          <w:cantSplit/>
+          <w:tblHeader/>
+        </w:trPr>
+        <w:tc>
+          <w:tcPr>
+            <w:tcW w:w="2591" w:type="dxa"/>
+            <w:shd w:val="clear" w:color="auto" w:fill="D9E2D5"/>
+          </w:tcPr>
+          <w:p>
+            <w:pPr>
+              <w:spacing w:before="40" w:after="40"/>
+              <w:jc w:val="left"/>
+              <w:rPr>
+                <w:rFonts w:ascii="Arial" w:hAnsi="Arial" w:cs="Arial"/>
+                <w:b/>
+                <w:bCs/>
+                <w:sz w:val="20"/>
+                <w:szCs w:val="20"/>
+              </w:rPr>
+            </w:pPr>
+            <w:r>
+              <w:rPr>
+                <w:rFonts w:ascii="Arial" w:hAnsi="Arial" w:cs="Arial"/>
+                <w:b/>
+                <w:bCs/>
+                <w:sz w:val="20"/>
+                <w:szCs w:val="20"/>
+              </w:rPr>
+              <w:t xml:space="preserve">Unidade</w:t>
+            </w:r>
+          </w:p>
+        </w:tc>
+        <w:tc>
+          <w:tcPr>
+            <w:tcW w:w="1196" w:type="dxa"/>
+            <w:shd w:val="clear" w:color="auto" w:fill="D9E2D5"/>
+          </w:tcPr>
+          <w:p>
+            <w:pPr>
+              <w:spacing w:before="40" w:after="40"/>
+              <w:jc w:val="right"/>
+              <w:rPr>
+                <w:rFonts w:ascii="Arial" w:hAnsi="Arial" w:cs="Arial"/>
+                <w:b/>
+                <w:bCs/>
+                <w:sz w:val="20"/>
+                <w:szCs w:val="20"/>
+              </w:rPr>
+            </w:pPr>
+            <w:r>
+              <w:rPr>
+                <w:rFonts w:ascii="Arial" w:hAnsi="Arial" w:cs="Arial"/>
+                <w:b/>
+                <w:bCs/>
+                <w:sz w:val="20"/>
+                <w:szCs w:val="20"/>
+              </w:rPr>
+              <w:t xml:space="preserve">Respostas</w:t>
+            </w:r>
+          </w:p>
+        </w:tc>
+        <w:tc>
+          <w:tcPr>
+            <w:tcW w:w="1096" w:type="dxa"/>
+            <w:shd w:val="clear" w:color="auto" w:fill="D9E2D5"/>
+          </w:tcPr>
+          <w:p>
+            <w:pPr>
+              <w:spacing w:before="40" w:after="40"/>
+              <w:jc w:val="right"/>
+              <w:rPr>
+                <w:rFonts w:ascii="Arial" w:hAnsi="Arial" w:cs="Arial"/>
+                <w:b/>
+                <w:bCs/>
+                <w:sz w:val="20"/>
+                <w:szCs w:val="20"/>
+              </w:rPr>
+            </w:pPr>
+            <w:r>
+              <w:rPr>
+                <w:rFonts w:ascii="Arial" w:hAnsi="Arial" w:cs="Arial"/>
+                <w:b/>
+                <w:bCs/>
+                <w:sz w:val="20"/>
+                <w:szCs w:val="20"/>
+              </w:rPr>
+              <w:t xml:space="preserve">Recusas</w:t>
+            </w:r>
+          </w:p>
+        </w:tc>
+        <w:tc>
+          <w:tcPr>
+            <w:tcW w:w="1595" w:type="dxa"/>
+            <w:shd w:val="clear" w:color="auto" w:fill="D9E2D5"/>
+          </w:tcPr>
+          <w:p>
+            <w:pPr>
+              <w:spacing w:before="40" w:after="40"/>
+              <w:jc w:val="right"/>
+              <w:rPr>
+                <w:rFonts w:ascii="Arial" w:hAnsi="Arial" w:cs="Arial"/>
+                <w:b/>
+                <w:bCs/>
+                <w:sz w:val="20"/>
+                <w:szCs w:val="20"/>
+              </w:rPr>
+            </w:pPr>
+            <w:r>
+              <w:rPr>
+                <w:rFonts w:ascii="Arial" w:hAnsi="Arial" w:cs="Arial"/>
+                <w:b/>
+                <w:bCs/>
+                <w:sz w:val="20"/>
+                <w:szCs w:val="20"/>
+              </w:rPr>
+              <w:t xml:space="preserve">Nota geral (NPS)</w:t>
+            </w:r>
+          </w:p>
+        </w:tc>
+        <w:tc>
+          <w:tcPr>
+            <w:tcW w:w="1296" w:type="dxa"/>
+            <w:shd w:val="clear" w:color="auto" w:fill="D9E2D5"/>
+          </w:tcPr>
+          <w:p>
+            <w:pPr>
+              <w:spacing w:before="40" w:after="40"/>
+              <w:jc w:val="right"/>
+              <w:rPr>
+                <w:rFonts w:ascii="Arial" w:hAnsi="Arial" w:cs="Arial"/>
+                <w:b/>
+                <w:bCs/>
+                <w:sz w:val="20"/>
+                <w:szCs w:val="20"/>
+              </w:rPr>
+            </w:pPr>
+            <w:r>
+              <w:rPr>
+                <w:rFonts w:ascii="Arial" w:hAnsi="Arial" w:cs="Arial"/>
+                <w:b/>
+                <w:bCs/>
+                <w:sz w:val="20"/>
+                <w:szCs w:val="20"/>
+              </w:rPr>
+              <w:t xml:space="preserve">Satisfação</w:t>
+            </w:r>
+          </w:p>
+        </w:tc>
+        <w:tc>
+          <w:tcPr>
+            <w:tcW w:w="1296" w:type="dxa"/>
+            <w:shd w:val="clear" w:color="auto" w:fill="D9E2D5"/>
+          </w:tcPr>
+          <w:p>
+            <w:pPr>
+              <w:spacing w:before="40" w:after="40"/>
+              <w:jc w:val="center"/>
+              <w:rPr>
+                <w:rFonts w:ascii="Arial" w:hAnsi="Arial" w:cs="Arial"/>
+                <w:b/>
+                <w:bCs/>
+                <w:sz w:val="20"/>
+                <w:szCs w:val="20"/>
+              </w:rPr>
+            </w:pPr>
+            <w:r>
+              <w:rPr>
+                <w:rFonts w:ascii="Arial" w:hAnsi="Arial" w:cs="Arial"/>
+                <w:b/>
+                <w:bCs/>
+                <w:sz w:val="20"/>
+                <w:szCs w:val="20"/>
+              </w:rPr>
+              <w:t xml:space="preserve">Situação</w:t>
+            </w:r>
+          </w:p>
+        </w:tc>
+      </w:tr>
+      <w:tr>
+        <w:trPr>
+          <w:cantSplit/>
+        </w:trPr>
+        <w:tc>
+          <w:tcPr>
+            <w:tcW w:w="2591" w:type="dxa"/>
+          </w:tcPr>
+          <w:p>
+            <w:pPr>
+              <w:spacing w:before="40" w:after="40"/>
+              <w:jc w:val="left"/>
+              <w:rPr>
+                <w:rFonts w:ascii="Arial" w:hAnsi="Arial" w:cs="Arial"/>
+                <w:sz w:val="20"/>
+                <w:szCs w:val="20"/>
+              </w:rPr>
+            </w:pPr>
+            <w:r>
+              <w:rPr>
+                <w:rFonts w:ascii="Arial" w:hAnsi="Arial" w:cs="Arial"/>
+                <w:sz w:val="20"/>
+                <w:szCs w:val="20"/>
+              </w:rPr>
+              <w:t xml:space="preserve">{#satisfacaoUnidades}{nome}</w:t>
+            </w:r>
+          </w:p>
+        </w:tc>
+        <w:tc>
+          <w:tcPr>
+            <w:tcW w:w="1196" w:type="dxa"/>
+          </w:tcPr>
+          <w:p>
+            <w:pPr>
+              <w:spacing w:before="40" w:after="40"/>
+              <w:jc w:val="right"/>
+              <w:rPr>
+                <w:rFonts w:ascii="Arial" w:hAnsi="Arial" w:cs="Arial"/>
+                <w:sz w:val="20"/>
+                <w:szCs w:val="20"/>
+              </w:rPr>
+            </w:pPr>
+            <w:r>
+              <w:rPr>
+                <w:rFonts w:ascii="Arial" w:hAnsi="Arial" w:cs="Arial"/>
+                <w:sz w:val="20"/>
+                <w:szCs w:val="20"/>
+              </w:rPr>
+              <w:t xml:space="preserve">{respostas}</w:t>
+            </w:r>
+          </w:p>
+        </w:tc>
+        <w:tc>
+          <w:tcPr>
+            <w:tcW w:w="1096" w:type="dxa"/>
+          </w:tcPr>
+          <w:p>
+            <w:pPr>
+              <w:spacing w:before="40" w:after="40"/>
+              <w:jc w:val="right"/>
+              <w:rPr>
+                <w:rFonts w:ascii="Arial" w:hAnsi="Arial" w:cs="Arial"/>
+                <w:sz w:val="20"/>
+                <w:szCs w:val="20"/>
+              </w:rPr>
+            </w:pPr>
+            <w:r>
+              <w:rPr>
+                <w:rFonts w:ascii="Arial" w:hAnsi="Arial" w:cs="Arial"/>
+                <w:sz w:val="20"/>
+                <w:szCs w:val="20"/>
+              </w:rPr>
+              <w:t xml:space="preserve">{recusas}</w:t>
+            </w:r>
+          </w:p>
+        </w:tc>
+        <w:tc>
+          <w:tcPr>
+            <w:tcW w:w="1595" w:type="dxa"/>
+          </w:tcPr>
+          <w:p>
+            <w:pPr>
+              <w:spacing w:before="40" w:after="40"/>
+              <w:jc w:val="right"/>
+              <w:rPr>
+                <w:rFonts w:ascii="Arial" w:hAnsi="Arial" w:cs="Arial"/>
+                <w:sz w:val="20"/>
+                <w:szCs w:val="20"/>
+              </w:rPr>
+            </w:pPr>
+            <w:r>
+              <w:rPr>
+                <w:rFonts w:ascii="Arial" w:hAnsi="Arial" w:cs="Arial"/>
+                <w:sz w:val="20"/>
+                <w:szCs w:val="20"/>
+              </w:rPr>
+              <w:t xml:space="preserve">{nps}</w:t>
+            </w:r>
+          </w:p>
+        </w:tc>
+        <w:tc>
+          <w:tcPr>
+            <w:tcW w:w="1296" w:type="dxa"/>
+          </w:tcPr>
+          <w:p>
+            <w:pPr>
+              <w:spacing w:before="40" w:after="40"/>
+              <w:jc w:val="right"/>
+              <w:rPr>
+                <w:rFonts w:ascii="Arial" w:hAnsi="Arial" w:cs="Arial"/>
+                <w:sz w:val="20"/>
+                <w:szCs w:val="20"/>
+              </w:rPr>
+            </w:pPr>
+            <w:r>
+              <w:rPr>
+                <w:rFonts w:ascii="Arial" w:hAnsi="Arial" w:cs="Arial"/>
+                <w:sz w:val="20"/>
+                <w:szCs w:val="20"/>
+              </w:rPr>
+              <w:t xml:space="preserve">{satisfacao}</w:t>
+            </w:r>
+          </w:p>
+        </w:tc>
+        <w:tc>
+          <w:tcPr>
+            <w:tcW w:w="1296" w:type="dxa"/>
+          </w:tcPr>
+          <w:p>
+            <w:pPr>
+              <w:spacing w:before="40" w:after="40"/>
+              <w:jc w:val="center"/>
+              <w:rPr>
+                <w:rFonts w:ascii="Arial" w:hAnsi="Arial" w:cs="Arial"/>
+                <w:sz w:val="20"/>
+                <w:szCs w:val="20"/>
+              </w:rPr>
+            </w:pPr>
+            <w:r>
+              <w:rPr>
+                <w:rFonts w:ascii="Arial" w:hAnsi="Arial" w:cs="Arial"/>
+                <w:sz w:val="20"/>
+                <w:szCs w:val="20"/>
+              </w:rPr>
+              <w:t xml:space="preserve">{situacao}{/satisfacaoUnidades}</w:t>
+            </w:r>
+          </w:p>
+        </w:tc>
+      </w:tr>
+    </w:tbl>
+    <w:p>
+      <w:pPr>
+        <w:spacing w:before="0" w:after="120" w:line="240" w:lineRule="auto"/>
+        <w:rPr>
+          <w:rFonts w:ascii="Arial" w:hAnsi="Arial" w:cs="Arial"/>
+          <w:sz w:val="24"/>
+          <w:szCs w:val="24"/>
+        </w:rPr>
+      </w:pPr>
+    </w:p>
+    <w:p>
+      <w:pPr>
+        <w:spacing w:before="0" w:after="0" w:line="240" w:lineRule="auto"/>
+        <w:rPr>
+          <w:rFonts w:ascii="Arial" w:hAnsi="Arial" w:cs="Arial"/>
+          <w:sz w:val="24"/>
+          <w:szCs w:val="24"/>
+        </w:rPr>
+      </w:pPr>
+      <w:r>
+        <w:rPr>
+          <w:rFonts w:ascii="Arial" w:hAnsi="Arial" w:cs="Arial"/>
+          <w:sz w:val="24"/>
+          <w:szCs w:val="24"/>
+        </w:rPr>
+        <w:t xml:space="preserve">{#temComentariosSatisfacao}</w:t>
+      </w:r>
+    </w:p>
+    <w:p>
+      <w:pPr>
+        <w:keepNext/>
+        <w:spacing w:before="120" w:after="60" w:line="240" w:lineRule="auto"/>
+        <w:rPr>
+          <w:rFonts w:ascii="Arial" w:hAnsi="Arial" w:cs="Arial"/>
+          <w:b/>
+          <w:bCs/>
+          <w:sz w:val="24"/>
+          <w:szCs w:val="24"/>
+        </w:rPr>
+      </w:pPr>
+      <w:r>
+        <w:rPr>
+          <w:rFonts w:ascii="Arial" w:hAnsi="Arial" w:cs="Arial"/>
+          <w:b/>
+          <w:bCs/>
+          <w:sz w:val="24"/>
+          <w:szCs w:val="24"/>
+        </w:rPr>
+        <w:t xml:space="preserve">Trechos dos comentários das famílias</w:t>
+      </w:r>
+    </w:p>
+    <w:p>
+      <w:pPr>
+        <w:spacing w:before="0" w:after="0" w:line="240" w:lineRule="auto"/>
+        <w:rPr>
+          <w:rFonts w:ascii="Arial" w:hAnsi="Arial" w:cs="Arial"/>
+          <w:sz w:val="24"/>
+          <w:szCs w:val="24"/>
+        </w:rPr>
+      </w:pPr>
+      <w:r>
+        <w:rPr>
+          <w:rFonts w:ascii="Arial" w:hAnsi="Arial" w:cs="Arial"/>
+          <w:sz w:val="24"/>
+          <w:szCs w:val="24"/>
+        </w:rPr>
+        <w:t xml:space="preserve">{#comentariosSatisfacao}</w:t>
+      </w:r>
+    </w:p>
+    <w:p>
+      <w:pPr>
+        <w:spacing w:before="0" w:after="120" w:line="360" w:lineRule="auto"/>
+        <w:jc w:val="both"/>
+        <w:rPr>
+          <w:rFonts w:ascii="Arial" w:hAnsi="Arial" w:cs="Arial"/>
+          <w:sz w:val="24"/>
+          <w:szCs w:val="24"/>
+        </w:rPr>
+      </w:pPr>
+      <w:r>
+        <w:rPr>
+          <w:rFonts w:ascii="Arial" w:hAnsi="Arial" w:cs="Arial"/>
+          <w:sz w:val="24"/>
+          <w:szCs w:val="24"/>
+        </w:rPr>
+        <w:t xml:space="preserve">“{texto}” ({sigla})</w:t>
+      </w:r>
+    </w:p>
+    <w:p>
+      <w:pPr>
+        <w:spacing w:before="0" w:after="0" w:line="240" w:lineRule="auto"/>
+        <w:rPr>
+          <w:rFonts w:ascii="Arial" w:hAnsi="Arial" w:cs="Arial"/>
+          <w:sz w:val="24"/>
+          <w:szCs w:val="24"/>
+        </w:rPr>
+      </w:pPr>
+      <w:r>
+        <w:rPr>
+          <w:rFonts w:ascii="Arial" w:hAnsi="Arial" w:cs="Arial"/>
+          <w:sz w:val="24"/>
+          <w:szCs w:val="24"/>
+        </w:rPr>
+        <w:t xml:space="preserve">{/comentariosSatisfacao}</w:t>
+      </w:r>
+    </w:p>
+    <w:p>
+      <w:pPr>
+        <w:spacing w:before="0" w:after="0" w:line="240" w:lineRule="auto"/>
+        <w:rPr>
+          <w:rFonts w:ascii="Arial" w:hAnsi="Arial" w:cs="Arial"/>
+          <w:sz w:val="24"/>
+          <w:szCs w:val="24"/>
+        </w:rPr>
+      </w:pPr>
+      <w:r>
+        <w:rPr>
+          <w:rFonts w:ascii="Arial" w:hAnsi="Arial" w:cs="Arial"/>
+          <w:sz w:val="24"/>
+          <w:szCs w:val="24"/>
+        </w:rPr>
+        <w:t xml:space="preserve">{/temComentariosSatisfacao}</w:t>
+      </w:r>
+    </w:p>
+    <w:p>
+      <w:pPr>
+        <w:spacing w:before="0" w:after="0" w:line="240" w:lineRule="auto"/>
+        <w:rPr>
+          <w:rFonts w:ascii="Arial" w:hAnsi="Arial" w:cs="Arial"/>
+          <w:sz w:val="24"/>
+          <w:szCs w:val="24"/>
+        </w:rPr>
+      </w:pPr>
+      <w:r>
+        <w:rPr>
+          <w:rFonts w:ascii="Arial" w:hAnsi="Arial" w:cs="Arial"/>
+          <w:sz w:val="24"/>
+          <w:szCs w:val="24"/>
+        </w:rPr>
+        <w:t xml:space="preserve">{/temSatisfacao}</w:t>
+      </w:r>
+    </w:p>
+    <w:p>
+      <w:pPr>
+        <w:keepNext/>
+        <w:spacing w:before="240" w:after="120" w:line="240" w:lineRule="auto"/>
+        <w:rPr>
+          <w:rFonts w:ascii="Arial" w:hAnsi="Arial" w:cs="Arial"/>
+          <w:b/>
+          <w:bCs/>
+          <w:sz w:val="24"/>
+          <w:szCs w:val="24"/>
+        </w:rPr>
+      </w:pPr>
+      <w:r>
+        <w:rPr>
+          <w:rFonts w:ascii="Arial" w:hAnsi="Arial" w:cs="Arial"/>
+          <w:b/>
+          <w:bCs/>
+          <w:sz w:val="24"/>
+          <w:szCs w:val="24"/>
+        </w:rPr>
+        <w:t xml:space="preserve">6. Considerações finais</w:t>
       </w:r>
     </w:p>
     <w:p>

</xml_diff>